<commit_message>
Update README.md with actual project screenshots
</commit_message>
<xml_diff>
--- a/SmartCorrect_AI_Submission.docx
+++ b/SmartCorrect_AI_Submission.docx
@@ -2298,13 +2298,27 @@
         </w:rPr>
         <w:t xml:space="preserve">HuggingFace Fill-Mask Model Hub: </w:t>
       </w:r>
-      <w:r>
-        <w:rPr>
-          <w:i/>
-          <w:sz w:val="19"/>
-        </w:rPr>
-        <w:t>https://huggingface.co/bert-base-uncased</w:t>
-      </w:r>
+      <w:hyperlink r:id="rId7" w:history="1">
+        <w:r>
+          <w:rPr>
+            <w:rStyle w:val="Hyperlink"/>
+            <w:i/>
+            <w:sz w:val="19"/>
+          </w:rPr>
+          <w:t>https://huggingface.co/bert-base-uncased</w:t>
+        </w:r>
+      </w:hyperlink>
+    </w:p>
+    <w:p>
+      <w:pPr>
+        <w:pStyle w:val="ListBullet"/>
+        <w:numPr>
+          <w:ilvl w:val="0"/>
+          <w:numId w:val="0"/>
+        </w:numPr>
+        <w:spacing w:after="60"/>
+        <w:ind w:left="360"/>
+      </w:pPr>
     </w:p>
     <w:p>
       <w:pPr>
@@ -2318,13 +2332,27 @@
         </w:rPr>
         <w:t xml:space="preserve">TextBlob Spelling Correction Documentation: </w:t>
       </w:r>
-      <w:r>
-        <w:rPr>
-          <w:i/>
-          <w:sz w:val="19"/>
-        </w:rPr>
-        <w:t>https://textblob.readthedocs.io/en/dev/</w:t>
-      </w:r>
+      <w:hyperlink r:id="rId8" w:history="1">
+        <w:r>
+          <w:rPr>
+            <w:rStyle w:val="Hyperlink"/>
+            <w:i/>
+            <w:sz w:val="19"/>
+          </w:rPr>
+          <w:t>https://textblob.readthedocs.io/en/dev/</w:t>
+        </w:r>
+      </w:hyperlink>
+    </w:p>
+    <w:p>
+      <w:pPr>
+        <w:pStyle w:val="ListBullet"/>
+        <w:numPr>
+          <w:ilvl w:val="0"/>
+          <w:numId w:val="0"/>
+        </w:numPr>
+        <w:spacing w:after="60"/>
+        <w:ind w:left="360"/>
+      </w:pPr>
     </w:p>
     <w:p>
       <w:pPr>
@@ -2338,13 +2366,27 @@
         </w:rPr>
         <w:t xml:space="preserve">Peter Norvig's Spelling Correction Heuristic Algorithm: </w:t>
       </w:r>
-      <w:r>
-        <w:rPr>
-          <w:i/>
-          <w:sz w:val="19"/>
-        </w:rPr>
-        <w:t>https://norvig.com/spell-correct.html</w:t>
-      </w:r>
+      <w:hyperlink r:id="rId9" w:history="1">
+        <w:r>
+          <w:rPr>
+            <w:rStyle w:val="Hyperlink"/>
+            <w:i/>
+            <w:sz w:val="19"/>
+          </w:rPr>
+          <w:t>https://norvig.com/spell-correct.html</w:t>
+        </w:r>
+      </w:hyperlink>
+    </w:p>
+    <w:p>
+      <w:pPr>
+        <w:pStyle w:val="ListBullet"/>
+        <w:numPr>
+          <w:ilvl w:val="0"/>
+          <w:numId w:val="0"/>
+        </w:numPr>
+        <w:spacing w:after="60"/>
+        <w:ind w:left="360"/>
+      </w:pPr>
     </w:p>
     <w:p>
       <w:pPr>
@@ -2358,13 +2400,27 @@
         </w:rPr>
         <w:t xml:space="preserve">Streamlit Resource Caching Guide: </w:t>
       </w:r>
-      <w:r>
-        <w:rPr>
-          <w:i/>
-          <w:sz w:val="19"/>
-        </w:rPr>
-        <w:t>https://docs.streamlit.io/library/api-reference/performance/st.cache_resource</w:t>
-      </w:r>
+      <w:hyperlink r:id="rId10" w:history="1">
+        <w:r>
+          <w:rPr>
+            <w:rStyle w:val="Hyperlink"/>
+            <w:i/>
+            <w:sz w:val="19"/>
+          </w:rPr>
+          <w:t>https://docs.streamlit.io/library/api-reference/performance/st.cache_resource</w:t>
+        </w:r>
+      </w:hyperlink>
+    </w:p>
+    <w:p>
+      <w:pPr>
+        <w:pStyle w:val="ListBullet"/>
+        <w:numPr>
+          <w:ilvl w:val="0"/>
+          <w:numId w:val="0"/>
+        </w:numPr>
+        <w:spacing w:after="60"/>
+        <w:ind w:left="360"/>
+      </w:pPr>
     </w:p>
     <w:p>
       <w:pPr>
@@ -2378,12 +2434,269 @@
         </w:rPr>
         <w:t xml:space="preserve">NLTK Tagging and Tokenization Corpora: </w:t>
       </w:r>
+      <w:hyperlink r:id="rId11" w:history="1">
+        <w:r>
+          <w:rPr>
+            <w:rStyle w:val="Hyperlink"/>
+            <w:i/>
+            <w:sz w:val="19"/>
+          </w:rPr>
+          <w:t>https://www.nltk.org/api/nltk.tokenize.html</w:t>
+        </w:r>
+      </w:hyperlink>
+    </w:p>
+    <w:p>
+      <w:pPr>
+        <w:pStyle w:val="ListBullet"/>
+        <w:numPr>
+          <w:ilvl w:val="0"/>
+          <w:numId w:val="0"/>
+        </w:numPr>
+        <w:spacing w:after="60"/>
+        <w:ind w:left="360"/>
+        <w:rPr>
+          <w:b/>
+          <w:sz w:val="19"/>
+        </w:rPr>
+      </w:pPr>
+    </w:p>
+    <w:p>
+      <w:pPr>
+        <w:pStyle w:val="ListBullet"/>
+        <w:numPr>
+          <w:ilvl w:val="0"/>
+          <w:numId w:val="0"/>
+        </w:numPr>
+        <w:spacing w:after="60"/>
+        <w:ind w:left="360"/>
+        <w:rPr>
+          <w:b/>
+          <w:sz w:val="19"/>
+        </w:rPr>
+      </w:pPr>
+    </w:p>
+    <w:p>
+      <w:pPr>
+        <w:pStyle w:val="ListBullet"/>
+        <w:numPr>
+          <w:ilvl w:val="0"/>
+          <w:numId w:val="0"/>
+        </w:numPr>
+        <w:spacing w:after="60"/>
+        <w:ind w:left="360" w:hanging="360"/>
+        <w:rPr>
+          <w:b/>
+          <w:bCs/>
+          <w:sz w:val="28"/>
+          <w:szCs w:val="32"/>
+        </w:rPr>
+      </w:pPr>
       <w:r>
         <w:rPr>
-          <w:i/>
-          <w:sz w:val="19"/>
+          <w:b/>
+          <w:bCs/>
+          <w:sz w:val="28"/>
+          <w:szCs w:val="32"/>
         </w:rPr>
-        <w:t>https://www.nltk.org/api/nltk.tokenize.html</w:t>
+        <w:t>11. Screenshots</w:t>
+      </w:r>
+    </w:p>
+    <w:p>
+      <w:pPr>
+        <w:pStyle w:val="ListBullet"/>
+        <w:numPr>
+          <w:ilvl w:val="0"/>
+          <w:numId w:val="0"/>
+        </w:numPr>
+        <w:spacing w:after="60"/>
+        <w:ind w:left="360" w:hanging="360"/>
+        <w:rPr>
+          <w:b/>
+          <w:bCs/>
+          <w:sz w:val="28"/>
+          <w:szCs w:val="32"/>
+        </w:rPr>
+      </w:pPr>
+    </w:p>
+    <w:p>
+      <w:pPr>
+        <w:pStyle w:val="ListBullet"/>
+        <w:numPr>
+          <w:ilvl w:val="0"/>
+          <w:numId w:val="0"/>
+        </w:numPr>
+        <w:spacing w:after="60"/>
+        <w:ind w:left="360" w:hanging="360"/>
+        <w:rPr>
+          <w:b/>
+          <w:bCs/>
+          <w:sz w:val="28"/>
+          <w:szCs w:val="32"/>
+        </w:rPr>
+      </w:pPr>
+      <w:r>
+        <w:rPr>
+          <w:b/>
+          <w:bCs/>
+          <w:sz w:val="28"/>
+          <w:szCs w:val="32"/>
+        </w:rPr>
+        <w:drawing>
+          <wp:inline distT="0" distB="0" distL="0" distR="0" wp14:anchorId="00C92B1B" wp14:editId="3F9DE0F5">
+            <wp:extent cx="5943600" cy="3056255"/>
+            <wp:effectExtent l="0" t="0" r="0" b="0"/>
+            <wp:docPr id="1996888954" name="Picture 1"/>
+            <wp:cNvGraphicFramePr>
+              <a:graphicFrameLocks xmlns:a="http://schemas.openxmlformats.org/drawingml/2006/main" noChangeAspect="1"/>
+            </wp:cNvGraphicFramePr>
+            <a:graphic xmlns:a="http://schemas.openxmlformats.org/drawingml/2006/main">
+              <a:graphicData uri="http://schemas.openxmlformats.org/drawingml/2006/picture">
+                <pic:pic xmlns:pic="http://schemas.openxmlformats.org/drawingml/2006/picture">
+                  <pic:nvPicPr>
+                    <pic:cNvPr id="1996888954" name=""/>
+                    <pic:cNvPicPr/>
+                  </pic:nvPicPr>
+                  <pic:blipFill>
+                    <a:blip r:embed="rId12"/>
+                    <a:stretch>
+                      <a:fillRect/>
+                    </a:stretch>
+                  </pic:blipFill>
+                  <pic:spPr>
+                    <a:xfrm>
+                      <a:off x="0" y="0"/>
+                      <a:ext cx="5943600" cy="3056255"/>
+                    </a:xfrm>
+                    <a:prstGeom prst="rect">
+                      <a:avLst/>
+                    </a:prstGeom>
+                  </pic:spPr>
+                </pic:pic>
+              </a:graphicData>
+            </a:graphic>
+          </wp:inline>
+        </w:drawing>
+      </w:r>
+    </w:p>
+    <w:p>
+      <w:pPr>
+        <w:pStyle w:val="ListBullet"/>
+        <w:numPr>
+          <w:ilvl w:val="0"/>
+          <w:numId w:val="0"/>
+        </w:numPr>
+        <w:spacing w:after="60"/>
+        <w:ind w:left="360" w:hanging="360"/>
+        <w:rPr>
+          <w:b/>
+          <w:bCs/>
+          <w:sz w:val="28"/>
+          <w:szCs w:val="32"/>
+        </w:rPr>
+      </w:pPr>
+      <w:r>
+        <w:rPr>
+          <w:b/>
+          <w:bCs/>
+          <w:sz w:val="28"/>
+          <w:szCs w:val="32"/>
+        </w:rPr>
+        <w:lastRenderedPageBreak/>
+        <w:drawing>
+          <wp:inline distT="0" distB="0" distL="0" distR="0" wp14:anchorId="4582F44D" wp14:editId="0578530E">
+            <wp:extent cx="5943600" cy="3220720"/>
+            <wp:effectExtent l="0" t="0" r="0" b="0"/>
+            <wp:docPr id="1458290382" name="Picture 1"/>
+            <wp:cNvGraphicFramePr>
+              <a:graphicFrameLocks xmlns:a="http://schemas.openxmlformats.org/drawingml/2006/main" noChangeAspect="1"/>
+            </wp:cNvGraphicFramePr>
+            <a:graphic xmlns:a="http://schemas.openxmlformats.org/drawingml/2006/main">
+              <a:graphicData uri="http://schemas.openxmlformats.org/drawingml/2006/picture">
+                <pic:pic xmlns:pic="http://schemas.openxmlformats.org/drawingml/2006/picture">
+                  <pic:nvPicPr>
+                    <pic:cNvPr id="1458290382" name=""/>
+                    <pic:cNvPicPr/>
+                  </pic:nvPicPr>
+                  <pic:blipFill>
+                    <a:blip r:embed="rId13"/>
+                    <a:stretch>
+                      <a:fillRect/>
+                    </a:stretch>
+                  </pic:blipFill>
+                  <pic:spPr>
+                    <a:xfrm>
+                      <a:off x="0" y="0"/>
+                      <a:ext cx="5943600" cy="3220720"/>
+                    </a:xfrm>
+                    <a:prstGeom prst="rect">
+                      <a:avLst/>
+                    </a:prstGeom>
+                  </pic:spPr>
+                </pic:pic>
+              </a:graphicData>
+            </a:graphic>
+          </wp:inline>
+        </w:drawing>
+      </w:r>
+    </w:p>
+    <w:p>
+      <w:pPr>
+        <w:pStyle w:val="ListBullet"/>
+        <w:numPr>
+          <w:ilvl w:val="0"/>
+          <w:numId w:val="0"/>
+        </w:numPr>
+        <w:spacing w:after="60"/>
+        <w:ind w:left="360" w:hanging="360"/>
+        <w:rPr>
+          <w:b/>
+          <w:bCs/>
+          <w:sz w:val="28"/>
+          <w:szCs w:val="32"/>
+        </w:rPr>
+      </w:pPr>
+      <w:r>
+        <w:rPr>
+          <w:b/>
+          <w:bCs/>
+          <w:sz w:val="28"/>
+          <w:szCs w:val="32"/>
+        </w:rPr>
+        <w:drawing>
+          <wp:inline distT="0" distB="0" distL="0" distR="0" wp14:anchorId="0015217B" wp14:editId="154E65DE">
+            <wp:extent cx="5943600" cy="3084195"/>
+            <wp:effectExtent l="0" t="0" r="0" b="1905"/>
+            <wp:docPr id="289479406" name="Picture 1"/>
+            <wp:cNvGraphicFramePr>
+              <a:graphicFrameLocks xmlns:a="http://schemas.openxmlformats.org/drawingml/2006/main" noChangeAspect="1"/>
+            </wp:cNvGraphicFramePr>
+            <a:graphic xmlns:a="http://schemas.openxmlformats.org/drawingml/2006/main">
+              <a:graphicData uri="http://schemas.openxmlformats.org/drawingml/2006/picture">
+                <pic:pic xmlns:pic="http://schemas.openxmlformats.org/drawingml/2006/picture">
+                  <pic:nvPicPr>
+                    <pic:cNvPr id="289479406" name=""/>
+                    <pic:cNvPicPr/>
+                  </pic:nvPicPr>
+                  <pic:blipFill>
+                    <a:blip r:embed="rId14"/>
+                    <a:stretch>
+                      <a:fillRect/>
+                    </a:stretch>
+                  </pic:blipFill>
+                  <pic:spPr>
+                    <a:xfrm>
+                      <a:off x="0" y="0"/>
+                      <a:ext cx="5943600" cy="3084195"/>
+                    </a:xfrm>
+                    <a:prstGeom prst="rect">
+                      <a:avLst/>
+                    </a:prstGeom>
+                  </pic:spPr>
+                </pic:pic>
+              </a:graphicData>
+            </a:graphic>
+          </wp:inline>
+        </w:drawing>
       </w:r>
     </w:p>
     <w:sectPr>

</xml_diff>